<commit_message>
recorte da v0.358: o livro passa a ser o Ciclo Maldito (R43)
Entra livro/Ciclo-Maldito-Livro-de-Regras.pdf, o livro de regras final,
no lugar do Manual da Guilda (.pdf e .docx de revisão). Sai a pasta
manual/, com o manual do Fundamento v7.

O resto do recorte foi posto em dia com o repositório de trabalho na
v0.358: as 27 peças, os desenhos, as duas fichas e o bloco de inimigo,
e entram a edição integrada dos Caminhos e o capítulo de Invocações da
v0.331.

O README diz que o livro é a edição atual e que os textos de caminhos/,
invocacoes/ e desenho/ são registros de antes dele.

Co-Authored-By: Claude Opus 5.5 <noreply@anthropic.com>
</commit_message>
<xml_diff>
--- a/ficha/bloco-de-inimigo.docx
+++ b/ficha/bloco-de-inimigo.docx
@@ -15,7 +15,7 @@
           <w:sz w:val="15"/>
           <w:szCs w:val="15"/>
         </w:rPr>
-        <w:t xml:space="preserve">PROJETO - M</w:t>
+        <w:t xml:space="preserve">CICLO MALDITO</w:t>
       </w:r>
     </w:p>
     <w:p>
@@ -715,7 +715,7 @@
                 <w:sz w:val="13"/>
                 <w:szCs w:val="13"/>
               </w:rPr>
-              <w:t xml:space="preserve">TRAÇOS — PASSIVAS, APTIDÕES E TÉCNICA</w:t>
+              <w:t xml:space="preserve">TRAÇOS — TALENTOS, APTIDÕES E TÉCNICA</w:t>
             </w:r>
           </w:p>
           <w:p>
@@ -960,7 +960,7 @@
           <w:sz w:val="15"/>
           <w:szCs w:val="15"/>
         </w:rPr>
-        <w:t xml:space="preserve">PROJETO - M</w:t>
+        <w:t xml:space="preserve">CICLO MALDITO</w:t>
       </w:r>
     </w:p>
     <w:p>
@@ -1667,7 +1667,7 @@
                 <w:sz w:val="13"/>
                 <w:szCs w:val="13"/>
               </w:rPr>
-              <w:t xml:space="preserve">TRAÇOS — PASSIVAS, APTIDÕES E TÉCNICA</w:t>
+              <w:t xml:space="preserve">TRAÇOS — TALENTOS, APTIDÕES E TÉCNICA</w:t>
             </w:r>
           </w:p>
           <w:p>
@@ -1679,7 +1679,7 @@
                 <w:sz w:val="19"/>
                 <w:szCs w:val="19"/>
               </w:rPr>
-              <w:t xml:space="preserve">Escama (Passiva) · duas aptidões do catálogo da peça 11</w:t>
+              <w:t xml:space="preserve">Escama (Talento) · duas aptidões do capítulo de Aptidões e Refino</w:t>
             </w:r>
           </w:p>
         </w:tc>
@@ -1904,7 +1904,7 @@
           <w:sz w:val="15"/>
           <w:szCs w:val="15"/>
         </w:rPr>
-        <w:t xml:space="preserve">PROJETO - M</w:t>
+        <w:t xml:space="preserve">CICLO MALDITO</w:t>
       </w:r>
     </w:p>
     <w:p>
@@ -1937,7 +1937,7 @@
         <w:t xml:space="preserve">Nenhum número foi escolhido:</w:t>
       </w:r>
       <w:r>
-        <w:t xml:space="preserve"> todos saem das tabelas do fim desta folha, e os atributos cabem na criação da peça 2, com nove pontos e teto </w:t>
+        <w:t xml:space="preserve"> todos saem das tabelas do fim desta folha, e os atributos cabem na criação de personagem, com nove pontos e teto </w:t>
       </w:r>
       <w:r>
         <w:rPr>
@@ -3375,7 +3375,7 @@
           <w:sz w:val="15"/>
           <w:szCs w:val="15"/>
         </w:rPr>
-        <w:t xml:space="preserve">PROJETO - M</w:t>
+        <w:t xml:space="preserve">CICLO MALDITO</w:t>
       </w:r>
     </w:p>
     <w:p>
@@ -4334,7 +4334,7 @@
           <w:sz w:val="15"/>
           <w:szCs w:val="15"/>
         </w:rPr>
-        <w:t xml:space="preserve">PROJETO - M</w:t>
+        <w:t xml:space="preserve">CICLO MALDITO</w:t>
       </w:r>
     </w:p>
     <w:p>
@@ -5293,7 +5293,7 @@
           <w:sz w:val="15"/>
           <w:szCs w:val="15"/>
         </w:rPr>
-        <w:t xml:space="preserve">PROJETO - M</w:t>
+        <w:t xml:space="preserve">CICLO MALDITO</w:t>
       </w:r>
     </w:p>
     <w:p>
@@ -6548,7 +6548,7 @@
           <w:sz w:val="15"/>
           <w:szCs w:val="15"/>
         </w:rPr>
-        <w:t xml:space="preserve">PROJETO - M</w:t>
+        <w:t xml:space="preserve">CICLO MALDITO</w:t>
       </w:r>
     </w:p>
     <w:p>
@@ -7681,7 +7681,7 @@
           <w:sz w:val="15"/>
           <w:szCs w:val="15"/>
         </w:rPr>
-        <w:t xml:space="preserve">PROJETO - M</w:t>
+        <w:t xml:space="preserve">CICLO MALDITO</w:t>
       </w:r>
     </w:p>
     <w:p>
@@ -8909,7 +8909,7 @@
           <w:sz w:val="15"/>
           <w:szCs w:val="15"/>
         </w:rPr>
-        <w:t xml:space="preserve">PROJETO - M</w:t>
+        <w:t xml:space="preserve">CICLO MALDITO</w:t>
       </w:r>
     </w:p>
     <w:p>
@@ -10335,7 +10335,7 @@
           <w:sz w:val="15"/>
           <w:szCs w:val="15"/>
         </w:rPr>
-        <w:t xml:space="preserve">PROJETO - M</w:t>
+        <w:t xml:space="preserve">CICLO MALDITO</w:t>
       </w:r>
     </w:p>
     <w:p>
@@ -25546,7 +25546,7 @@
         <w:sz w:val="14"/>
         <w:szCs w:val="14"/>
       </w:rPr>
-      <w:t xml:space="preserve">Projeto - M · bloco de inimigo · peça 26</w:t>
+      <w:t xml:space="preserve">Ciclo Maldito · bloco de inimigo</w:t>
     </w:r>
   </w:p>
 </w:ftr>

</xml_diff>